<commit_message>
Invoice generator adds a static run-time value for the 'magic number' order id that prevents nulled returns. Updates notification templates.
</commit_message>
<xml_diff>
--- a/CUWebinars.Web/App_Data/mergeTemplates/ConfirmationOfAccount.docx
+++ b/CUWebinars.Web/App_Data/mergeTemplates/ConfirmationOfAccount.docx
@@ -434,14 +434,27 @@
             <w:r>
               <w:t xml:space="preserve">Dear </w:t>
             </w:r>
-            <w:fldSimple w:instr=" MERGEFIELD  FirstName  \* MERGEFORMAT ">
-              <w:r>
-                <w:rPr>
-                  <w:noProof/>
-                </w:rPr>
-                <w:t>«FirstName»</w:t>
-              </w:r>
-            </w:fldSimple>
+            <w:r>
+              <w:fldChar w:fldCharType="begin"/>
+            </w:r>
+            <w:r>
+              <w:instrText xml:space="preserve"> MERGEFIELD  FirstName  \* MERGEFORMAT </w:instrText>
+            </w:r>
+            <w:r>
+              <w:fldChar w:fldCharType="separate"/>
+            </w:r>
+            <w:r>
+              <w:rPr>
+                <w:noProof/>
+              </w:rPr>
+              <w:t>«FirstName»</w:t>
+            </w:r>
+            <w:r>
+              <w:rPr>
+                <w:noProof/>
+              </w:rPr>
+              <w:fldChar w:fldCharType="end"/>
+            </w:r>
             <w:r>
               <w:t>,</w:t>
             </w:r>
@@ -583,7 +596,9 @@
             <w:tcW w:w="265" w:type="dxa"/>
             <w:shd w:val="clear" w:color="auto" w:fill="4D677F"/>
           </w:tcPr>
-          <w:p/>
+          <w:p>
+            <w:bookmarkStart w:id="1" w:name="_GoBack" w:colFirst="1" w:colLast="1"/>
+          </w:p>
         </w:tc>
         <w:tc>
           <w:tcPr>
@@ -605,7 +620,61 @@
             <w:tr>
               <w:tc>
                 <w:tcPr>
-                  <w:tcW w:w="4304" w:type="dxa"/>
+                  <w:tcW w:w="4297" w:type="dxa"/>
+                </w:tcPr>
+                <w:bookmarkStart w:id="2" w:name="OLE_LINK1"/>
+                <w:bookmarkStart w:id="3" w:name="OLE_LINK2"/>
+                <w:p>
+                  <w:pPr>
+                    <w:jc w:val="center"/>
+                    <w:rPr>
+                      <w:sz w:val="18"/>
+                      <w:szCs w:val="18"/>
+                    </w:rPr>
+                  </w:pPr>
+                  <w:r>
+                    <w:rPr>
+                      <w:sz w:val="18"/>
+                      <w:szCs w:val="18"/>
+                    </w:rPr>
+                    <w:fldChar w:fldCharType="begin"/>
+                  </w:r>
+                  <w:r>
+                    <w:rPr>
+                      <w:sz w:val="18"/>
+                      <w:szCs w:val="18"/>
+                    </w:rPr>
+                    <w:instrText xml:space="preserve"> MERGEFIELD  AffFooter  \* MERGEFORMAT </w:instrText>
+                  </w:r>
+                  <w:r>
+                    <w:rPr>
+                      <w:sz w:val="18"/>
+                      <w:szCs w:val="18"/>
+                    </w:rPr>
+                    <w:fldChar w:fldCharType="separate"/>
+                  </w:r>
+                  <w:r>
+                    <w:rPr>
+                      <w:noProof/>
+                      <w:sz w:val="18"/>
+                      <w:szCs w:val="18"/>
+                    </w:rPr>
+                    <w:t>«AffFooter»</w:t>
+                  </w:r>
+                  <w:r>
+                    <w:rPr>
+                      <w:sz w:val="18"/>
+                      <w:szCs w:val="18"/>
+                    </w:rPr>
+                    <w:fldChar w:fldCharType="end"/>
+                  </w:r>
+                  <w:bookmarkEnd w:id="2"/>
+                  <w:bookmarkEnd w:id="3"/>
+                </w:p>
+              </w:tc>
+              <w:tc>
+                <w:tcPr>
+                  <w:tcW w:w="4298" w:type="dxa"/>
                 </w:tcPr>
                 <w:p>
                   <w:pPr>
@@ -627,7 +696,7 @@
                       <w:sz w:val="18"/>
                       <w:szCs w:val="18"/>
                     </w:rPr>
-                    <w:instrText xml:space="preserve"> MERGEFIELD  AffFooter  \* MERGEFORMAT </w:instrText>
+                    <w:instrText xml:space="preserve"> MERGEFIELD  SupportEmail  \* MERGEFORMAT </w:instrText>
                   </w:r>
                   <w:r>
                     <w:rPr>
@@ -642,7 +711,7 @@
                       <w:sz w:val="18"/>
                       <w:szCs w:val="18"/>
                     </w:rPr>
-                    <w:t>«AffFooter»</w:t>
+                    <w:t>«SupportEmail»</w:t>
                   </w:r>
                   <w:r>
                     <w:rPr>
@@ -650,12 +719,38 @@
                       <w:szCs w:val="18"/>
                     </w:rPr>
                     <w:fldChar w:fldCharType="end"/>
+                  </w:r>
+                </w:p>
+                <w:p>
+                  <w:pPr>
+                    <w:jc w:val="center"/>
+                    <w:rPr>
+                      <w:sz w:val="18"/>
+                      <w:szCs w:val="18"/>
+                    </w:rPr>
+                  </w:pPr>
+                  <w:r>
+                    <w:rPr>
+                      <w:sz w:val="18"/>
+                      <w:szCs w:val="18"/>
+                    </w:rPr>
+                    <w:t>800-831-0678</w:t>
+                  </w:r>
+                  <w:r>
+                    <w:rPr>
+                      <w:sz w:val="18"/>
+                      <w:szCs w:val="18"/>
+                    </w:rPr>
+                    <w:t xml:space="preserve"> </w:t>
                   </w:r>
                 </w:p>
               </w:tc>
+            </w:tr>
+            <w:tr>
               <w:tc>
                 <w:tcPr>
-                  <w:tcW w:w="4305" w:type="dxa"/>
+                  <w:tcW w:w="8595" w:type="dxa"/>
+                  <w:gridSpan w:val="2"/>
                 </w:tcPr>
                 <w:p>
                   <w:pPr>
@@ -677,7 +772,7 @@
                       <w:sz w:val="18"/>
                       <w:szCs w:val="18"/>
                     </w:rPr>
-                    <w:instrText xml:space="preserve"> MERGEFIELD  SupportEmail  \* MERGEFORMAT </w:instrText>
+                    <w:instrText xml:space="preserve"> MERGEFIELD  ServiceNote  \* MERGEFORMAT </w:instrText>
                   </w:r>
                   <w:r>
                     <w:rPr>
@@ -692,7 +787,7 @@
                       <w:sz w:val="18"/>
                       <w:szCs w:val="18"/>
                     </w:rPr>
-                    <w:t>«SupportEmail»</w:t>
+                    <w:t>«ServiceNote»</w:t>
                   </w:r>
                   <w:r>
                     <w:rPr>
@@ -701,33 +796,6 @@
                     </w:rPr>
                     <w:fldChar w:fldCharType="end"/>
                   </w:r>
-                </w:p>
-                <w:p>
-                  <w:pPr>
-                    <w:jc w:val="center"/>
-                    <w:rPr>
-                      <w:sz w:val="18"/>
-                      <w:szCs w:val="18"/>
-                    </w:rPr>
-                  </w:pPr>
-                  <w:r>
-                    <w:rPr>
-                      <w:sz w:val="18"/>
-                      <w:szCs w:val="18"/>
-                    </w:rPr>
-                    <w:t>800-831-0678</w:t>
-                  </w:r>
-                  <w:bookmarkStart w:id="1" w:name="_GoBack"/>
-                  <w:bookmarkEnd w:id="1"/>
-                </w:p>
-                <w:p>
-                  <w:pPr>
-                    <w:jc w:val="center"/>
-                    <w:rPr>
-                      <w:sz w:val="18"/>
-                      <w:szCs w:val="18"/>
-                    </w:rPr>
-                  </w:pPr>
                 </w:p>
               </w:tc>
             </w:tr>
@@ -742,6 +810,7 @@
           <w:p/>
         </w:tc>
       </w:tr>
+      <w:bookmarkEnd w:id="1"/>
       <w:tr>
         <w:tc>
           <w:tcPr>
@@ -1934,7 +2003,7 @@
 </file>
 
 <file path=customXml/itemProps1.xml><?xml version="1.0" encoding="utf-8"?>
-<ds:datastoreItem xmlns:ds="http://schemas.openxmlformats.org/officeDocument/2006/customXml" ds:itemID="{5D37B7FA-D9A5-46A2-BF7D-AFE794925544}">
+<ds:datastoreItem xmlns:ds="http://schemas.openxmlformats.org/officeDocument/2006/customXml" ds:itemID="{4636C42B-7A5F-4F4D-A471-194B6104A7AF}">
   <ds:schemaRefs>
     <ds:schemaRef ds:uri="http://schemas.openxmlformats.org/officeDocument/2006/bibliography"/>
   </ds:schemaRefs>

</xml_diff>

<commit_message>
Updates email in template footers Move ShowWSP & CP reports out of affiliate/admin homepage for better perf. Adds search for 'wsp '.
</commit_message>
<xml_diff>
--- a/CUWebinars.Web/App_Data/mergeTemplates/ConfirmationOfAccount.docx
+++ b/CUWebinars.Web/App_Data/mergeTemplates/ConfirmationOfAccount.docx
@@ -1,6 +1,6 @@
 
 <file path=word/document.xml><?xml version="1.0" encoding="utf-8"?>
-<w:document xmlns:wpc="http://schemas.microsoft.com/office/word/2010/wordprocessingCanvas" xmlns:cx="http://schemas.microsoft.com/office/drawing/2014/chartex" xmlns:cx1="http://schemas.microsoft.com/office/drawing/2015/9/8/chartex" xmlns:cx2="http://schemas.microsoft.com/office/drawing/2015/10/21/chartex" xmlns:cx3="http://schemas.microsoft.com/office/drawing/2016/5/9/chartex" xmlns:cx4="http://schemas.microsoft.com/office/drawing/2016/5/10/chartex" xmlns:cx5="http://schemas.microsoft.com/office/drawing/2016/5/11/chartex" xmlns:mc="http://schemas.openxmlformats.org/markup-compatibility/2006" xmlns:o="urn:schemas-microsoft-com:office:office" xmlns:r="http://schemas.openxmlformats.org/officeDocument/2006/relationships" xmlns:m="http://schemas.openxmlformats.org/officeDocument/2006/math" xmlns:v="urn:schemas-microsoft-com:vml" xmlns:wp14="http://schemas.microsoft.com/office/word/2010/wordprocessingDrawing" xmlns:wp="http://schemas.openxmlformats.org/drawingml/2006/wordprocessingDrawing" xmlns:w10="urn:schemas-microsoft-com:office:word" xmlns:w="http://schemas.openxmlformats.org/wordprocessingml/2006/main" xmlns:w14="http://schemas.microsoft.com/office/word/2010/wordml" xmlns:w15="http://schemas.microsoft.com/office/word/2012/wordml" xmlns:w16se="http://schemas.microsoft.com/office/word/2015/wordml/symex" xmlns:wpg="http://schemas.microsoft.com/office/word/2010/wordprocessingGroup" xmlns:wpi="http://schemas.microsoft.com/office/word/2010/wordprocessingInk" xmlns:wne="http://schemas.microsoft.com/office/word/2006/wordml" xmlns:wps="http://schemas.microsoft.com/office/word/2010/wordprocessingShape" mc:Ignorable="w14 w15 w16se wp14">
+<w:document xmlns:wpc="http://schemas.microsoft.com/office/word/2010/wordprocessingCanvas" xmlns:cx="http://schemas.microsoft.com/office/drawing/2014/chartex" xmlns:cx1="http://schemas.microsoft.com/office/drawing/2015/9/8/chartex" xmlns:cx2="http://schemas.microsoft.com/office/drawing/2015/10/21/chartex" xmlns:cx3="http://schemas.microsoft.com/office/drawing/2016/5/9/chartex" xmlns:cx4="http://schemas.microsoft.com/office/drawing/2016/5/10/chartex" xmlns:cx5="http://schemas.microsoft.com/office/drawing/2016/5/11/chartex" xmlns:cx6="http://schemas.microsoft.com/office/drawing/2016/5/12/chartex" xmlns:cx7="http://schemas.microsoft.com/office/drawing/2016/5/13/chartex" xmlns:cx8="http://schemas.microsoft.com/office/drawing/2016/5/14/chartex" xmlns:mc="http://schemas.openxmlformats.org/markup-compatibility/2006" xmlns:aink="http://schemas.microsoft.com/office/drawing/2016/ink" xmlns:am3d="http://schemas.microsoft.com/office/drawing/2017/model3d" xmlns:o="urn:schemas-microsoft-com:office:office" xmlns:r="http://schemas.openxmlformats.org/officeDocument/2006/relationships" xmlns:m="http://schemas.openxmlformats.org/officeDocument/2006/math" xmlns:v="urn:schemas-microsoft-com:vml" xmlns:wp14="http://schemas.microsoft.com/office/word/2010/wordprocessingDrawing" xmlns:wp="http://schemas.openxmlformats.org/drawingml/2006/wordprocessingDrawing" xmlns:w10="urn:schemas-microsoft-com:office:word" xmlns:w="http://schemas.openxmlformats.org/wordprocessingml/2006/main" xmlns:w14="http://schemas.microsoft.com/office/word/2010/wordml" xmlns:w15="http://schemas.microsoft.com/office/word/2012/wordml" xmlns:w16cid="http://schemas.microsoft.com/office/word/2016/wordml/cid" xmlns:w16se="http://schemas.microsoft.com/office/word/2015/wordml/symex" xmlns:wpg="http://schemas.microsoft.com/office/word/2010/wordprocessingGroup" xmlns:wpi="http://schemas.microsoft.com/office/word/2010/wordprocessingInk" xmlns:wne="http://schemas.microsoft.com/office/word/2006/wordml" xmlns:wps="http://schemas.microsoft.com/office/word/2010/wordprocessingShape" mc:Ignorable="w14 w15 w16se w16cid wp14">
   <w:body>
     <w:tbl>
       <w:tblPr>
@@ -434,27 +434,14 @@
             <w:r>
               <w:t xml:space="preserve">Dear </w:t>
             </w:r>
-            <w:r>
-              <w:fldChar w:fldCharType="begin"/>
-            </w:r>
-            <w:r>
-              <w:instrText xml:space="preserve"> MERGEFIELD  FirstName  \* MERGEFORMAT </w:instrText>
-            </w:r>
-            <w:r>
-              <w:fldChar w:fldCharType="separate"/>
-            </w:r>
-            <w:r>
-              <w:rPr>
-                <w:noProof/>
-              </w:rPr>
-              <w:t>«FirstName»</w:t>
-            </w:r>
-            <w:r>
-              <w:rPr>
-                <w:noProof/>
-              </w:rPr>
-              <w:fldChar w:fldCharType="end"/>
-            </w:r>
+            <w:fldSimple w:instr=" MERGEFIELD  FirstName  \* MERGEFORMAT ">
+              <w:r>
+                <w:rPr>
+                  <w:noProof/>
+                </w:rPr>
+                <w:t>«FirstName»</w:t>
+              </w:r>
+            </w:fldSimple>
             <w:r>
               <w:t>,</w:t>
             </w:r>
@@ -596,9 +583,7 @@
             <w:tcW w:w="265" w:type="dxa"/>
             <w:shd w:val="clear" w:color="auto" w:fill="4D677F"/>
           </w:tcPr>
-          <w:p>
-            <w:bookmarkStart w:id="1" w:name="_GoBack" w:colFirst="1" w:colLast="1"/>
-          </w:p>
+          <w:p/>
         </w:tc>
         <w:tc>
           <w:tcPr>
@@ -622,8 +607,8 @@
                 <w:tcPr>
                   <w:tcW w:w="4297" w:type="dxa"/>
                 </w:tcPr>
-                <w:bookmarkStart w:id="2" w:name="OLE_LINK1"/>
-                <w:bookmarkStart w:id="3" w:name="OLE_LINK2"/>
+                <w:bookmarkStart w:id="1" w:name="OLE_LINK1"/>
+                <w:bookmarkStart w:id="2" w:name="OLE_LINK2"/>
                 <w:p>
                   <w:pPr>
                     <w:jc w:val="center"/>
@@ -668,8 +653,8 @@
                     </w:rPr>
                     <w:fldChar w:fldCharType="end"/>
                   </w:r>
+                  <w:bookmarkEnd w:id="1"/>
                   <w:bookmarkEnd w:id="2"/>
-                  <w:bookmarkEnd w:id="3"/>
                 </w:p>
               </w:tc>
               <w:tc>
@@ -684,43 +669,16 @@
                       <w:szCs w:val="18"/>
                     </w:rPr>
                   </w:pPr>
-                  <w:r>
-                    <w:rPr>
-                      <w:sz w:val="18"/>
-                      <w:szCs w:val="18"/>
-                    </w:rPr>
-                    <w:fldChar w:fldCharType="begin"/>
-                  </w:r>
-                  <w:r>
-                    <w:rPr>
-                      <w:sz w:val="18"/>
-                      <w:szCs w:val="18"/>
-                    </w:rPr>
-                    <w:instrText xml:space="preserve"> MERGEFIELD  SupportEmail  \* MERGEFORMAT </w:instrText>
-                  </w:r>
-                  <w:r>
-                    <w:rPr>
-                      <w:sz w:val="18"/>
-                      <w:szCs w:val="18"/>
-                    </w:rPr>
-                    <w:fldChar w:fldCharType="separate"/>
-                  </w:r>
-                  <w:r>
-                    <w:rPr>
-                      <w:noProof/>
-                      <w:sz w:val="18"/>
-                      <w:szCs w:val="18"/>
-                    </w:rPr>
-                    <w:t>«SupportEmail»</w:t>
-                  </w:r>
-                  <w:r>
-                    <w:rPr>
-                      <w:sz w:val="18"/>
-                      <w:szCs w:val="18"/>
-                    </w:rPr>
-                    <w:fldChar w:fldCharType="end"/>
+                  <w:bookmarkStart w:id="3" w:name="_GoBack"/>
+                  <w:r>
+                    <w:rPr>
+                      <w:sz w:val="18"/>
+                      <w:szCs w:val="18"/>
+                    </w:rPr>
+                    <w:t>info@ttstrain.com</w:t>
                   </w:r>
                 </w:p>
+                <w:bookmarkEnd w:id="3"/>
                 <w:p>
                   <w:pPr>
                     <w:jc w:val="center"/>
@@ -810,7 +768,6 @@
           <w:p/>
         </w:tc>
       </w:tr>
-      <w:bookmarkEnd w:id="1"/>
       <w:tr>
         <w:tc>
           <w:tcPr>
@@ -835,7 +792,7 @@
 </file>
 
 <file path=word/numbering.xml><?xml version="1.0" encoding="utf-8"?>
-<w:numbering xmlns:wpc="http://schemas.microsoft.com/office/word/2010/wordprocessingCanvas" xmlns:cx="http://schemas.microsoft.com/office/drawing/2014/chartex" xmlns:cx1="http://schemas.microsoft.com/office/drawing/2015/9/8/chartex" xmlns:cx2="http://schemas.microsoft.com/office/drawing/2015/10/21/chartex" xmlns:cx3="http://schemas.microsoft.com/office/drawing/2016/5/9/chartex" xmlns:cx4="http://schemas.microsoft.com/office/drawing/2016/5/10/chartex" xmlns:cx5="http://schemas.microsoft.com/office/drawing/2016/5/11/chartex" xmlns:mc="http://schemas.openxmlformats.org/markup-compatibility/2006" xmlns:o="urn:schemas-microsoft-com:office:office" xmlns:r="http://schemas.openxmlformats.org/officeDocument/2006/relationships" xmlns:m="http://schemas.openxmlformats.org/officeDocument/2006/math" xmlns:v="urn:schemas-microsoft-com:vml" xmlns:wp14="http://schemas.microsoft.com/office/word/2010/wordprocessingDrawing" xmlns:wp="http://schemas.openxmlformats.org/drawingml/2006/wordprocessingDrawing" xmlns:w10="urn:schemas-microsoft-com:office:word" xmlns:w="http://schemas.openxmlformats.org/wordprocessingml/2006/main" xmlns:w14="http://schemas.microsoft.com/office/word/2010/wordml" xmlns:w15="http://schemas.microsoft.com/office/word/2012/wordml" xmlns:w16se="http://schemas.microsoft.com/office/word/2015/wordml/symex" xmlns:wpg="http://schemas.microsoft.com/office/word/2010/wordprocessingGroup" xmlns:wpi="http://schemas.microsoft.com/office/word/2010/wordprocessingInk" xmlns:wne="http://schemas.microsoft.com/office/word/2006/wordml" xmlns:wps="http://schemas.microsoft.com/office/word/2010/wordprocessingShape" mc:Ignorable="w14 w15 w16se wp14">
+<w:numbering xmlns:wpc="http://schemas.microsoft.com/office/word/2010/wordprocessingCanvas" xmlns:cx="http://schemas.microsoft.com/office/drawing/2014/chartex" xmlns:cx1="http://schemas.microsoft.com/office/drawing/2015/9/8/chartex" xmlns:cx2="http://schemas.microsoft.com/office/drawing/2015/10/21/chartex" xmlns:cx3="http://schemas.microsoft.com/office/drawing/2016/5/9/chartex" xmlns:cx4="http://schemas.microsoft.com/office/drawing/2016/5/10/chartex" xmlns:cx5="http://schemas.microsoft.com/office/drawing/2016/5/11/chartex" xmlns:cx6="http://schemas.microsoft.com/office/drawing/2016/5/12/chartex" xmlns:cx7="http://schemas.microsoft.com/office/drawing/2016/5/13/chartex" xmlns:cx8="http://schemas.microsoft.com/office/drawing/2016/5/14/chartex" xmlns:mc="http://schemas.openxmlformats.org/markup-compatibility/2006" xmlns:aink="http://schemas.microsoft.com/office/drawing/2016/ink" xmlns:am3d="http://schemas.microsoft.com/office/drawing/2017/model3d" xmlns:o="urn:schemas-microsoft-com:office:office" xmlns:r="http://schemas.openxmlformats.org/officeDocument/2006/relationships" xmlns:m="http://schemas.openxmlformats.org/officeDocument/2006/math" xmlns:v="urn:schemas-microsoft-com:vml" xmlns:wp14="http://schemas.microsoft.com/office/word/2010/wordprocessingDrawing" xmlns:wp="http://schemas.openxmlformats.org/drawingml/2006/wordprocessingDrawing" xmlns:w10="urn:schemas-microsoft-com:office:word" xmlns:w="http://schemas.openxmlformats.org/wordprocessingml/2006/main" xmlns:w14="http://schemas.microsoft.com/office/word/2010/wordml" xmlns:w15="http://schemas.microsoft.com/office/word/2012/wordml" xmlns:w16cid="http://schemas.microsoft.com/office/word/2016/wordml/cid" xmlns:w16se="http://schemas.microsoft.com/office/word/2015/wordml/symex" xmlns:wpg="http://schemas.microsoft.com/office/word/2010/wordprocessingGroup" xmlns:wpi="http://schemas.microsoft.com/office/word/2010/wordprocessingInk" xmlns:wne="http://schemas.microsoft.com/office/word/2006/wordml" xmlns:wps="http://schemas.microsoft.com/office/word/2010/wordprocessingShape" mc:Ignorable="w14 w15 w16se w16cid wp14">
   <w:abstractNum w:abstractNumId="0" w15:restartNumberingAfterBreak="0">
     <w:nsid w:val="0DED66E9"/>
     <w:multiLevelType w:val="hybridMultilevel"/>
@@ -1229,7 +1186,7 @@
 </file>
 
 <file path=word/styles.xml><?xml version="1.0" encoding="utf-8"?>
-<w:styles xmlns:mc="http://schemas.openxmlformats.org/markup-compatibility/2006" xmlns:r="http://schemas.openxmlformats.org/officeDocument/2006/relationships" xmlns:w="http://schemas.openxmlformats.org/wordprocessingml/2006/main" xmlns:w14="http://schemas.microsoft.com/office/word/2010/wordml" xmlns:w15="http://schemas.microsoft.com/office/word/2012/wordml" xmlns:w16se="http://schemas.microsoft.com/office/word/2015/wordml/symex" mc:Ignorable="w14 w15 w16se">
+<w:styles xmlns:mc="http://schemas.openxmlformats.org/markup-compatibility/2006" xmlns:r="http://schemas.openxmlformats.org/officeDocument/2006/relationships" xmlns:w="http://schemas.openxmlformats.org/wordprocessingml/2006/main" xmlns:w14="http://schemas.microsoft.com/office/word/2010/wordml" xmlns:w15="http://schemas.microsoft.com/office/word/2012/wordml" xmlns:w16cid="http://schemas.microsoft.com/office/word/2016/wordml/cid" xmlns:w16se="http://schemas.microsoft.com/office/word/2015/wordml/symex" mc:Ignorable="w14 w15 w16se w16cid">
   <w:docDefaults>
     <w:rPrDefault>
       <w:rPr>
@@ -1245,7 +1202,7 @@
       </w:pPr>
     </w:pPrDefault>
   </w:docDefaults>
-  <w:latentStyles w:defLockedState="0" w:defUIPriority="99" w:defSemiHidden="0" w:defUnhideWhenUsed="0" w:defQFormat="0" w:count="374">
+  <w:latentStyles w:defLockedState="0" w:defUIPriority="99" w:defSemiHidden="0" w:defUnhideWhenUsed="0" w:defQFormat="0" w:count="375">
     <w:lsdException w:name="Normal" w:uiPriority="0" w:qFormat="1"/>
     <w:lsdException w:name="heading 1" w:uiPriority="9" w:qFormat="1"/>
     <w:lsdException w:name="heading 2" w:semiHidden="1" w:uiPriority="9" w:unhideWhenUsed="1" w:qFormat="1"/>
@@ -1351,7 +1308,6 @@
     <w:lsdException w:name="HTML Sample" w:semiHidden="1" w:unhideWhenUsed="1"/>
     <w:lsdException w:name="HTML Typewriter" w:semiHidden="1" w:unhideWhenUsed="1"/>
     <w:lsdException w:name="HTML Variable" w:semiHidden="1" w:unhideWhenUsed="1"/>
-    <w:lsdException w:name="Normal Table" w:semiHidden="1" w:unhideWhenUsed="1"/>
     <w:lsdException w:name="annotation subject" w:semiHidden="1" w:unhideWhenUsed="1"/>
     <w:lsdException w:name="No List" w:semiHidden="1" w:unhideWhenUsed="1"/>
     <w:lsdException w:name="Outline List 1" w:semiHidden="1" w:unhideWhenUsed="1"/>
@@ -1398,10 +1354,8 @@
     <w:lsdException w:name="Table Subtle 2" w:semiHidden="1" w:unhideWhenUsed="1"/>
     <w:lsdException w:name="Table Web 1" w:semiHidden="1" w:unhideWhenUsed="1"/>
     <w:lsdException w:name="Table Web 2" w:semiHidden="1" w:unhideWhenUsed="1"/>
-    <w:lsdException w:name="Table Web 3" w:semiHidden="1" w:unhideWhenUsed="1"/>
     <w:lsdException w:name="Balloon Text" w:semiHidden="1" w:unhideWhenUsed="1"/>
     <w:lsdException w:name="Table Grid" w:uiPriority="39"/>
-    <w:lsdException w:name="Table Theme" w:semiHidden="1" w:unhideWhenUsed="1"/>
     <w:lsdException w:name="Placeholder Text" w:semiHidden="1"/>
     <w:lsdException w:name="No Spacing" w:uiPriority="1" w:qFormat="1"/>
     <w:lsdException w:name="Light Shading" w:uiPriority="60"/>
@@ -1620,6 +1574,7 @@
     <w:lsdException w:name="Mention" w:semiHidden="1" w:unhideWhenUsed="1"/>
     <w:lsdException w:name="Smart Hyperlink" w:semiHidden="1" w:unhideWhenUsed="1"/>
     <w:lsdException w:name="Hashtag" w:semiHidden="1" w:unhideWhenUsed="1"/>
+    <w:lsdException w:name="Unresolved Mention" w:semiHidden="1" w:unhideWhenUsed="1"/>
   </w:latentStyles>
   <w:style w:type="paragraph" w:default="1" w:styleId="Normal">
     <w:name w:val="Normal"/>
@@ -2003,7 +1958,7 @@
 </file>
 
 <file path=customXml/itemProps1.xml><?xml version="1.0" encoding="utf-8"?>
-<ds:datastoreItem xmlns:ds="http://schemas.openxmlformats.org/officeDocument/2006/customXml" ds:itemID="{4636C42B-7A5F-4F4D-A471-194B6104A7AF}">
+<ds:datastoreItem xmlns:ds="http://schemas.openxmlformats.org/officeDocument/2006/customXml" ds:itemID="{DE75C637-905B-402B-BB22-C33BDD34662D}">
   <ds:schemaRefs>
     <ds:schemaRef ds:uri="http://schemas.openxmlformats.org/officeDocument/2006/bibliography"/>
   </ds:schemaRefs>

</xml_diff>

<commit_message>
Email templates are updated. Another round of chrome and copy tweaks.
</commit_message>
<xml_diff>
--- a/CUWebinars.Web/App_Data/mergeTemplates/ConfirmationOfAccount.docx
+++ b/CUWebinars.Web/App_Data/mergeTemplates/ConfirmationOfAccount.docx
@@ -17,17 +17,18 @@
         <w:tblLook w:val="04A0" w:firstRow="1" w:lastRow="0" w:firstColumn="1" w:lastColumn="0" w:noHBand="0" w:noVBand="1"/>
       </w:tblPr>
       <w:tblGrid>
-        <w:gridCol w:w="265"/>
-        <w:gridCol w:w="6305"/>
-        <w:gridCol w:w="2516"/>
-        <w:gridCol w:w="265"/>
+        <w:gridCol w:w="260"/>
+        <w:gridCol w:w="4420"/>
+        <w:gridCol w:w="1585"/>
+        <w:gridCol w:w="2835"/>
+        <w:gridCol w:w="260"/>
       </w:tblGrid>
       <w:tr>
         <w:tc>
           <w:tcPr>
-            <w:tcW w:w="9351" w:type="dxa"/>
-            <w:gridSpan w:val="4"/>
-            <w:shd w:val="clear" w:color="auto" w:fill="4D677F"/>
+            <w:tcW w:w="9360" w:type="dxa"/>
+            <w:gridSpan w:val="5"/>
+            <w:shd w:val="clear" w:color="auto" w:fill="3E67B1"/>
           </w:tcPr>
           <w:p>
             <w:pPr>
@@ -40,13 +41,7 @@
               <w:rPr>
                 <w:i/>
               </w:rPr>
-              <w:t>Account Created</w:t>
-            </w:r>
-            <w:r>
-              <w:rPr>
-                <w:i/>
-              </w:rPr>
-              <w:t xml:space="preserve"> for </w:t>
+              <w:t xml:space="preserve">Account Created for </w:t>
             </w:r>
             <w:r>
               <w:rPr>
@@ -85,48 +80,46 @@
       <w:tr>
         <w:tc>
           <w:tcPr>
-            <w:tcW w:w="265" w:type="dxa"/>
+            <w:tcW w:w="260" w:type="dxa"/>
             <w:tcBorders>
               <w:right w:val="single" w:sz="4" w:space="0" w:color="000000"/>
             </w:tcBorders>
-            <w:shd w:val="clear" w:color="auto" w:fill="4D677F"/>
+            <w:shd w:val="clear" w:color="auto" w:fill="3E67B1"/>
           </w:tcPr>
           <w:p/>
         </w:tc>
         <w:tc>
           <w:tcPr>
-            <w:tcW w:w="6305" w:type="dxa"/>
+            <w:tcW w:w="6005" w:type="dxa"/>
+            <w:gridSpan w:val="2"/>
             <w:tcBorders>
               <w:top w:val="single" w:sz="4" w:space="0" w:color="000000"/>
               <w:left w:val="single" w:sz="4" w:space="0" w:color="000000"/>
             </w:tcBorders>
-            <w:shd w:val="clear" w:color="auto" w:fill="4B5966"/>
+            <w:shd w:val="clear" w:color="auto" w:fill="F3F5F8"/>
           </w:tcPr>
           <w:p>
             <w:pPr>
+              <w:tabs>
+                <w:tab w:val="left" w:pos="3372"/>
+              </w:tabs>
+            </w:pPr>
+            <w:r>
               <w:rPr>
                 <w:noProof/>
               </w:rPr>
-            </w:pPr>
-            <w:bookmarkStart w:id="0" w:name="OLE_LINK6"/>
-            <w:r>
-              <w:rPr>
-                <w:noProof/>
-              </w:rPr>
               <w:t>[logo]</w:t>
             </w:r>
           </w:p>
-          <w:bookmarkEnd w:id="0"/>
-          <w:p/>
         </w:tc>
         <w:tc>
           <w:tcPr>
-            <w:tcW w:w="2516" w:type="dxa"/>
+            <w:tcW w:w="2835" w:type="dxa"/>
             <w:tcBorders>
               <w:top w:val="single" w:sz="4" w:space="0" w:color="000000"/>
               <w:right w:val="single" w:sz="4" w:space="0" w:color="000000"/>
             </w:tcBorders>
-            <w:shd w:val="clear" w:color="auto" w:fill="B9C8D5"/>
+            <w:shd w:val="clear" w:color="auto" w:fill="F3F5F8"/>
           </w:tcPr>
           <w:tbl>
             <w:tblPr>
@@ -366,11 +359,39 @@
         </w:tc>
         <w:tc>
           <w:tcPr>
-            <w:tcW w:w="265" w:type="dxa"/>
+            <w:tcW w:w="260" w:type="dxa"/>
             <w:tcBorders>
               <w:left w:val="single" w:sz="4" w:space="0" w:color="000000"/>
             </w:tcBorders>
-            <w:shd w:val="clear" w:color="auto" w:fill="4D677F"/>
+            <w:shd w:val="clear" w:color="auto" w:fill="3E67B1"/>
+          </w:tcPr>
+          <w:p/>
+          <w:p/>
+        </w:tc>
+      </w:tr>
+      <w:tr>
+        <w:tc>
+          <w:tcPr>
+            <w:tcW w:w="260" w:type="dxa"/>
+            <w:shd w:val="clear" w:color="auto" w:fill="3E67B1"/>
+          </w:tcPr>
+          <w:p/>
+        </w:tc>
+        <w:tc>
+          <w:tcPr>
+            <w:tcW w:w="8840" w:type="dxa"/>
+            <w:gridSpan w:val="3"/>
+            <w:shd w:val="clear" w:color="auto" w:fill="3E67B1"/>
+          </w:tcPr>
+          <w:p/>
+        </w:tc>
+        <w:tc>
+          <w:tcPr>
+            <w:tcW w:w="260" w:type="dxa"/>
+            <w:tcBorders>
+              <w:left w:val="nil"/>
+            </w:tcBorders>
+            <w:shd w:val="clear" w:color="auto" w:fill="3E67B1"/>
           </w:tcPr>
           <w:p/>
         </w:tc>
@@ -378,33 +399,184 @@
       <w:tr>
         <w:tc>
           <w:tcPr>
-            <w:tcW w:w="265" w:type="dxa"/>
+            <w:tcW w:w="260" w:type="dxa"/>
             <w:tcBorders>
               <w:right w:val="single" w:sz="4" w:space="0" w:color="auto"/>
             </w:tcBorders>
-            <w:shd w:val="clear" w:color="auto" w:fill="4D677F"/>
+            <w:shd w:val="clear" w:color="auto" w:fill="3E67B1"/>
           </w:tcPr>
           <w:p/>
         </w:tc>
         <w:tc>
           <w:tcPr>
-            <w:tcW w:w="8821" w:type="dxa"/>
-            <w:gridSpan w:val="2"/>
+            <w:tcW w:w="8840" w:type="dxa"/>
+            <w:gridSpan w:val="3"/>
             <w:tcBorders>
               <w:left w:val="single" w:sz="4" w:space="0" w:color="auto"/>
-              <w:right w:val="single" w:sz="4" w:space="0" w:color="auto"/>
+              <w:right w:val="single" w:sz="6" w:space="0" w:color="auto"/>
             </w:tcBorders>
-            <w:shd w:val="clear" w:color="auto" w:fill="000000" w:themeFill="text1"/>
           </w:tcPr>
+          <w:p>
+            <w:pPr>
+              <w:ind w:left="532" w:hanging="540"/>
+            </w:pPr>
+          </w:p>
+          <w:p>
+            <w:r>
+              <w:t xml:space="preserve">Dear </w:t>
+            </w:r>
+            <w:r>
+              <w:rPr>
+                <w:noProof/>
+              </w:rPr>
+              <w:fldChar w:fldCharType="begin"/>
+            </w:r>
+            <w:r>
+              <w:rPr>
+                <w:noProof/>
+              </w:rPr>
+              <w:instrText xml:space="preserve"> MERGEFIELD  FirstName  \* MERGEFORMAT </w:instrText>
+            </w:r>
+            <w:r>
+              <w:rPr>
+                <w:noProof/>
+              </w:rPr>
+              <w:fldChar w:fldCharType="separate"/>
+            </w:r>
+            <w:r>
+              <w:rPr>
+                <w:noProof/>
+              </w:rPr>
+              <w:t>«FirstName»</w:t>
+            </w:r>
+            <w:r>
+              <w:rPr>
+                <w:noProof/>
+              </w:rPr>
+              <w:fldChar w:fldCharType="end"/>
+            </w:r>
+            <w:r>
+              <w:t>,</w:t>
+            </w:r>
+          </w:p>
+          <w:p/>
+          <w:p>
+            <w:r>
+              <w:t xml:space="preserve">You order </w:t>
+            </w:r>
+            <w:r>
+              <w:t xml:space="preserve">for </w:t>
+            </w:r>
+            <w:r>
+              <w:rPr>
+                <w:i/>
+              </w:rPr>
+              <w:fldChar w:fldCharType="begin"/>
+            </w:r>
+            <w:r>
+              <w:rPr>
+                <w:i/>
+              </w:rPr>
+              <w:instrText xml:space="preserve"> MERGEFIELD  WebinarTitle  \* MERGEFORMAT </w:instrText>
+            </w:r>
+            <w:r>
+              <w:rPr>
+                <w:i/>
+              </w:rPr>
+              <w:fldChar w:fldCharType="separate"/>
+            </w:r>
+            <w:r>
+              <w:rPr>
+                <w:i/>
+                <w:noProof/>
+              </w:rPr>
+              <w:t>«WebinarTitle»</w:t>
+            </w:r>
+            <w:r>
+              <w:rPr>
+                <w:i/>
+              </w:rPr>
+              <w:fldChar w:fldCharType="end"/>
+            </w:r>
+            <w:r>
+              <w:t xml:space="preserve"> is c</w:t>
+            </w:r>
+            <w:r>
+              <w:t>omplete but</w:t>
+            </w:r>
+            <w:r>
+              <w:t xml:space="preserve"> your account</w:t>
+            </w:r>
+            <w:r>
+              <w:t xml:space="preserve"> requires confirmation. </w:t>
+            </w:r>
+            <w:r>
+              <w:t xml:space="preserve">The link below will prompt you to </w:t>
+            </w:r>
+            <w:r>
+              <w:t xml:space="preserve">choose your password. </w:t>
+            </w:r>
+          </w:p>
+          <w:p/>
+          <w:p>
+            <w:pPr>
+              <w:jc w:val="center"/>
+              <w:rPr>
+                <w:sz w:val="28"/>
+                <w:szCs w:val="28"/>
+              </w:rPr>
+            </w:pPr>
+            <w:r>
+              <w:rPr>
+                <w:sz w:val="28"/>
+                <w:szCs w:val="28"/>
+              </w:rPr>
+              <w:fldChar w:fldCharType="begin"/>
+            </w:r>
+            <w:r>
+              <w:rPr>
+                <w:sz w:val="28"/>
+                <w:szCs w:val="28"/>
+              </w:rPr>
+              <w:instrText xml:space="preserve"> MERGEFIELD  ConfirmAccountLink  \* MERGEFORMAT </w:instrText>
+            </w:r>
+            <w:r>
+              <w:rPr>
+                <w:sz w:val="28"/>
+                <w:szCs w:val="28"/>
+              </w:rPr>
+              <w:fldChar w:fldCharType="separate"/>
+            </w:r>
+            <w:r>
+              <w:rPr>
+                <w:noProof/>
+                <w:sz w:val="28"/>
+                <w:szCs w:val="28"/>
+              </w:rPr>
+              <w:t>«ConfirmAccountLink»</w:t>
+            </w:r>
+            <w:r>
+              <w:rPr>
+                <w:sz w:val="28"/>
+                <w:szCs w:val="28"/>
+              </w:rPr>
+              <w:fldChar w:fldCharType="end"/>
+            </w:r>
+          </w:p>
+          <w:p>
+            <w:pPr>
+              <w:ind w:left="532" w:hanging="540"/>
+            </w:pPr>
+          </w:p>
           <w:p/>
         </w:tc>
         <w:tc>
           <w:tcPr>
-            <w:tcW w:w="265" w:type="dxa"/>
+            <w:tcW w:w="260" w:type="dxa"/>
             <w:tcBorders>
-              <w:left w:val="single" w:sz="4" w:space="0" w:color="auto"/>
+              <w:left w:val="single" w:sz="6" w:space="0" w:color="auto"/>
             </w:tcBorders>
-            <w:shd w:val="clear" w:color="auto" w:fill="4D677F"/>
+            <w:shd w:val="clear" w:color="auto" w:fill="3E67B1"/>
           </w:tcPr>
           <w:p/>
         </w:tc>
@@ -412,167 +584,125 @@
       <w:tr>
         <w:tc>
           <w:tcPr>
-            <w:tcW w:w="265" w:type="dxa"/>
-            <w:tcBorders>
-              <w:right w:val="single" w:sz="4" w:space="0" w:color="auto"/>
-            </w:tcBorders>
-            <w:shd w:val="clear" w:color="auto" w:fill="4D677F"/>
+            <w:tcW w:w="260" w:type="dxa"/>
+            <w:shd w:val="clear" w:color="auto" w:fill="3E67B1"/>
           </w:tcPr>
+          <w:p/>
           <w:p/>
         </w:tc>
         <w:tc>
           <w:tcPr>
-            <w:tcW w:w="8821" w:type="dxa"/>
-            <w:gridSpan w:val="2"/>
-            <w:tcBorders>
-              <w:left w:val="single" w:sz="4" w:space="0" w:color="auto"/>
-              <w:right w:val="single" w:sz="6" w:space="0" w:color="auto"/>
-            </w:tcBorders>
+            <w:tcW w:w="4420" w:type="dxa"/>
+            <w:shd w:val="clear" w:color="auto" w:fill="243842"/>
           </w:tcPr>
-          <w:p/>
-          <w:p>
-            <w:r>
-              <w:t xml:space="preserve">Dear </w:t>
-            </w:r>
-            <w:fldSimple w:instr=" MERGEFIELD  FirstName  \* MERGEFORMAT ">
-              <w:r>
-                <w:rPr>
-                  <w:noProof/>
-                </w:rPr>
-                <w:t>«FirstName»</w:t>
-              </w:r>
-            </w:fldSimple>
-            <w:r>
-              <w:t>,</w:t>
-            </w:r>
-          </w:p>
-          <w:p/>
-          <w:p>
-            <w:r>
-              <w:t xml:space="preserve">You order </w:t>
-            </w:r>
-            <w:r>
-              <w:t xml:space="preserve">for </w:t>
-            </w:r>
-            <w:r>
-              <w:rPr>
-                <w:i/>
-              </w:rPr>
-              <w:fldChar w:fldCharType="begin"/>
-            </w:r>
-            <w:r>
-              <w:rPr>
-                <w:i/>
-              </w:rPr>
-              <w:instrText xml:space="preserve"> MERGEFIELD  WebinarTitle  \* MERGEFORMAT </w:instrText>
-            </w:r>
-            <w:r>
-              <w:rPr>
-                <w:i/>
-              </w:rPr>
-              <w:fldChar w:fldCharType="separate"/>
-            </w:r>
-            <w:r>
-              <w:rPr>
-                <w:i/>
-                <w:noProof/>
-              </w:rPr>
-              <w:t>«WebinarTitle»</w:t>
-            </w:r>
-            <w:r>
-              <w:rPr>
-                <w:i/>
-              </w:rPr>
-              <w:fldChar w:fldCharType="end"/>
-            </w:r>
-            <w:r>
-              <w:t xml:space="preserve"> is</w:t>
-            </w:r>
-            <w:r>
-              <w:t xml:space="preserve"> c</w:t>
-            </w:r>
-            <w:r>
-              <w:t>omplete but</w:t>
-            </w:r>
-            <w:r>
-              <w:t xml:space="preserve"> your account</w:t>
-            </w:r>
-            <w:r>
-              <w:t xml:space="preserve"> requires confirmation. </w:t>
-            </w:r>
-            <w:r>
-              <w:t xml:space="preserve">The link below will prompt you to </w:t>
-            </w:r>
-            <w:r>
-              <w:t>choose your password</w:t>
-            </w:r>
-            <w:r>
-              <w:t xml:space="preserve">. </w:t>
-            </w:r>
-          </w:p>
-          <w:p/>
           <w:p>
             <w:pPr>
               <w:jc w:val="center"/>
               <w:rPr>
-                <w:sz w:val="28"/>
-                <w:szCs w:val="28"/>
+                <w:sz w:val="18"/>
+                <w:szCs w:val="18"/>
               </w:rPr>
             </w:pPr>
-            <w:r>
-              <w:rPr>
-                <w:sz w:val="28"/>
-                <w:szCs w:val="28"/>
-              </w:rPr>
-              <w:fldChar w:fldCharType="begin"/>
-            </w:r>
-            <w:r>
-              <w:rPr>
-                <w:sz w:val="28"/>
-                <w:szCs w:val="28"/>
-              </w:rPr>
-              <w:instrText xml:space="preserve"> MERGEFIELD  ConfirmAccountLink  \* MERGEFORMAT </w:instrText>
-            </w:r>
-            <w:r>
-              <w:rPr>
-                <w:sz w:val="28"/>
-                <w:szCs w:val="28"/>
-              </w:rPr>
-              <w:fldChar w:fldCharType="separate"/>
-            </w:r>
-            <w:r>
-              <w:rPr>
-                <w:noProof/>
-                <w:sz w:val="28"/>
-                <w:szCs w:val="28"/>
-              </w:rPr>
-              <w:t>«ConfirmAccountLink»</w:t>
-            </w:r>
-            <w:r>
-              <w:rPr>
-                <w:sz w:val="28"/>
-                <w:szCs w:val="28"/>
-              </w:rPr>
-              <w:fldChar w:fldCharType="end"/>
-            </w:r>
           </w:p>
           <w:p>
             <w:pPr>
+              <w:jc w:val="center"/>
+            </w:pPr>
+            <w:r>
               <w:rPr>
                 <w:sz w:val="18"/>
                 <w:szCs w:val="18"/>
               </w:rPr>
-            </w:pPr>
+              <w:fldChar w:fldCharType="begin"/>
+            </w:r>
+            <w:r>
+              <w:rPr>
+                <w:sz w:val="18"/>
+                <w:szCs w:val="18"/>
+              </w:rPr>
+              <w:instrText xml:space="preserve"> MERGEFIELD  AffFooter  \* MERGEFORMAT </w:instrText>
+            </w:r>
+            <w:r>
+              <w:rPr>
+                <w:sz w:val="18"/>
+                <w:szCs w:val="18"/>
+              </w:rPr>
+              <w:fldChar w:fldCharType="separate"/>
+            </w:r>
+            <w:r>
+              <w:rPr>
+                <w:noProof/>
+                <w:sz w:val="18"/>
+                <w:szCs w:val="18"/>
+              </w:rPr>
+              <w:t>«AffFooter»</w:t>
+            </w:r>
+            <w:r>
+              <w:rPr>
+                <w:sz w:val="18"/>
+                <w:szCs w:val="18"/>
+              </w:rPr>
+              <w:fldChar w:fldCharType="end"/>
+            </w:r>
           </w:p>
-          <w:p/>
         </w:tc>
         <w:tc>
           <w:tcPr>
-            <w:tcW w:w="265" w:type="dxa"/>
-            <w:tcBorders>
-              <w:left w:val="single" w:sz="6" w:space="0" w:color="auto"/>
-            </w:tcBorders>
-            <w:shd w:val="clear" w:color="auto" w:fill="4D677F"/>
+            <w:tcW w:w="4420" w:type="dxa"/>
+            <w:gridSpan w:val="2"/>
+            <w:shd w:val="clear" w:color="auto" w:fill="243842"/>
+          </w:tcPr>
+          <w:p>
+            <w:pPr>
+              <w:jc w:val="center"/>
+              <w:rPr>
+                <w:sz w:val="18"/>
+                <w:szCs w:val="18"/>
+              </w:rPr>
+            </w:pPr>
+          </w:p>
+          <w:p>
+            <w:pPr>
+              <w:jc w:val="center"/>
+              <w:rPr>
+                <w:sz w:val="18"/>
+                <w:szCs w:val="18"/>
+              </w:rPr>
+            </w:pPr>
+            <w:r>
+              <w:rPr>
+                <w:sz w:val="18"/>
+                <w:szCs w:val="18"/>
+              </w:rPr>
+              <w:t>info@ttstrain.com</w:t>
+            </w:r>
+          </w:p>
+          <w:p>
+            <w:pPr>
+              <w:jc w:val="center"/>
+              <w:rPr>
+                <w:sz w:val="18"/>
+                <w:szCs w:val="18"/>
+              </w:rPr>
+            </w:pPr>
+            <w:r>
+              <w:rPr>
+                <w:sz w:val="18"/>
+                <w:szCs w:val="18"/>
+              </w:rPr>
+              <w:t>800-831-0678</w:t>
+            </w:r>
+          </w:p>
+          <w:p>
+            <w:pPr>
+              <w:jc w:val="center"/>
+            </w:pPr>
+          </w:p>
+        </w:tc>
+        <w:tc>
+          <w:tcPr>
+            <w:tcW w:w="260" w:type="dxa"/>
+            <w:shd w:val="clear" w:color="auto" w:fill="3E67B1"/>
           </w:tcPr>
           <w:p/>
         </w:tc>
@@ -580,190 +710,67 @@
       <w:tr>
         <w:tc>
           <w:tcPr>
-            <w:tcW w:w="265" w:type="dxa"/>
-            <w:shd w:val="clear" w:color="auto" w:fill="4D677F"/>
+            <w:tcW w:w="260" w:type="dxa"/>
+            <w:shd w:val="clear" w:color="auto" w:fill="3E67B1"/>
           </w:tcPr>
           <w:p/>
         </w:tc>
         <w:tc>
           <w:tcPr>
-            <w:tcW w:w="8821" w:type="dxa"/>
-            <w:gridSpan w:val="2"/>
-            <w:shd w:val="clear" w:color="auto" w:fill="000000" w:themeFill="text1"/>
+            <w:tcW w:w="8840" w:type="dxa"/>
+            <w:gridSpan w:val="3"/>
+            <w:shd w:val="clear" w:color="auto" w:fill="86BE48"/>
           </w:tcPr>
-          <w:p/>
-          <w:tbl>
-            <w:tblPr>
-              <w:tblStyle w:val="TableGrid"/>
-              <w:tblW w:w="0" w:type="auto"/>
-              <w:tblLook w:val="04A0" w:firstRow="1" w:lastRow="0" w:firstColumn="1" w:lastColumn="0" w:noHBand="0" w:noVBand="1"/>
-            </w:tblPr>
-            <w:tblGrid>
-              <w:gridCol w:w="4297"/>
-              <w:gridCol w:w="4298"/>
-            </w:tblGrid>
-            <w:tr>
-              <w:tc>
-                <w:tcPr>
-                  <w:tcW w:w="4297" w:type="dxa"/>
-                </w:tcPr>
-                <w:bookmarkStart w:id="1" w:name="OLE_LINK1"/>
-                <w:bookmarkStart w:id="2" w:name="OLE_LINK2"/>
-                <w:p>
-                  <w:pPr>
-                    <w:jc w:val="center"/>
-                    <w:rPr>
-                      <w:sz w:val="18"/>
-                      <w:szCs w:val="18"/>
-                    </w:rPr>
-                  </w:pPr>
-                  <w:r>
-                    <w:rPr>
-                      <w:sz w:val="18"/>
-                      <w:szCs w:val="18"/>
-                    </w:rPr>
-                    <w:fldChar w:fldCharType="begin"/>
-                  </w:r>
-                  <w:r>
-                    <w:rPr>
-                      <w:sz w:val="18"/>
-                      <w:szCs w:val="18"/>
-                    </w:rPr>
-                    <w:instrText xml:space="preserve"> MERGEFIELD  AffFooter  \* MERGEFORMAT </w:instrText>
-                  </w:r>
-                  <w:r>
-                    <w:rPr>
-                      <w:sz w:val="18"/>
-                      <w:szCs w:val="18"/>
-                    </w:rPr>
-                    <w:fldChar w:fldCharType="separate"/>
-                  </w:r>
-                  <w:r>
-                    <w:rPr>
-                      <w:noProof/>
-                      <w:sz w:val="18"/>
-                      <w:szCs w:val="18"/>
-                    </w:rPr>
-                    <w:t>«AffFooter»</w:t>
-                  </w:r>
-                  <w:r>
-                    <w:rPr>
-                      <w:sz w:val="18"/>
-                      <w:szCs w:val="18"/>
-                    </w:rPr>
-                    <w:fldChar w:fldCharType="end"/>
-                  </w:r>
-                  <w:bookmarkEnd w:id="1"/>
-                  <w:bookmarkEnd w:id="2"/>
-                </w:p>
-              </w:tc>
-              <w:tc>
-                <w:tcPr>
-                  <w:tcW w:w="4298" w:type="dxa"/>
-                </w:tcPr>
-                <w:p>
-                  <w:pPr>
-                    <w:jc w:val="center"/>
-                    <w:rPr>
-                      <w:sz w:val="18"/>
-                      <w:szCs w:val="18"/>
-                    </w:rPr>
-                  </w:pPr>
-                  <w:bookmarkStart w:id="3" w:name="_GoBack"/>
-                  <w:r>
-                    <w:rPr>
-                      <w:sz w:val="18"/>
-                      <w:szCs w:val="18"/>
-                    </w:rPr>
-                    <w:t>info@ttstrain.com</w:t>
-                  </w:r>
-                </w:p>
-                <w:bookmarkEnd w:id="3"/>
-                <w:p>
-                  <w:pPr>
-                    <w:jc w:val="center"/>
-                    <w:rPr>
-                      <w:sz w:val="18"/>
-                      <w:szCs w:val="18"/>
-                    </w:rPr>
-                  </w:pPr>
-                  <w:r>
-                    <w:rPr>
-                      <w:sz w:val="18"/>
-                      <w:szCs w:val="18"/>
-                    </w:rPr>
-                    <w:t>800-831-0678</w:t>
-                  </w:r>
-                  <w:r>
-                    <w:rPr>
-                      <w:sz w:val="18"/>
-                      <w:szCs w:val="18"/>
-                    </w:rPr>
-                    <w:t xml:space="preserve"> </w:t>
-                  </w:r>
-                </w:p>
-              </w:tc>
-            </w:tr>
-            <w:tr>
-              <w:tc>
-                <w:tcPr>
-                  <w:tcW w:w="8595" w:type="dxa"/>
-                  <w:gridSpan w:val="2"/>
-                </w:tcPr>
-                <w:p>
-                  <w:pPr>
-                    <w:jc w:val="center"/>
-                    <w:rPr>
-                      <w:sz w:val="18"/>
-                      <w:szCs w:val="18"/>
-                    </w:rPr>
-                  </w:pPr>
-                  <w:r>
-                    <w:rPr>
-                      <w:sz w:val="18"/>
-                      <w:szCs w:val="18"/>
-                    </w:rPr>
-                    <w:fldChar w:fldCharType="begin"/>
-                  </w:r>
-                  <w:r>
-                    <w:rPr>
-                      <w:sz w:val="18"/>
-                      <w:szCs w:val="18"/>
-                    </w:rPr>
-                    <w:instrText xml:space="preserve"> MERGEFIELD  ServiceNote  \* MERGEFORMAT </w:instrText>
-                  </w:r>
-                  <w:r>
-                    <w:rPr>
-                      <w:sz w:val="18"/>
-                      <w:szCs w:val="18"/>
-                    </w:rPr>
-                    <w:fldChar w:fldCharType="separate"/>
-                  </w:r>
-                  <w:r>
-                    <w:rPr>
-                      <w:noProof/>
-                      <w:sz w:val="18"/>
-                      <w:szCs w:val="18"/>
-                    </w:rPr>
-                    <w:t>«ServiceNote»</w:t>
-                  </w:r>
-                  <w:r>
-                    <w:rPr>
-                      <w:sz w:val="18"/>
-                      <w:szCs w:val="18"/>
-                    </w:rPr>
-                    <w:fldChar w:fldCharType="end"/>
-                  </w:r>
-                </w:p>
-              </w:tc>
-            </w:tr>
-          </w:tbl>
-          <w:p/>
+          <w:p>
+            <w:pPr>
+              <w:jc w:val="center"/>
+              <w:rPr>
+                <w:sz w:val="18"/>
+                <w:szCs w:val="18"/>
+              </w:rPr>
+            </w:pPr>
+            <w:r>
+              <w:rPr>
+                <w:sz w:val="18"/>
+                <w:szCs w:val="18"/>
+              </w:rPr>
+              <w:fldChar w:fldCharType="begin"/>
+            </w:r>
+            <w:r>
+              <w:rPr>
+                <w:sz w:val="18"/>
+                <w:szCs w:val="18"/>
+              </w:rPr>
+              <w:instrText xml:space="preserve"> MERGEFIELD  ServiceNote  \* MERGEFORMAT </w:instrText>
+            </w:r>
+            <w:r>
+              <w:rPr>
+                <w:sz w:val="18"/>
+                <w:szCs w:val="18"/>
+              </w:rPr>
+              <w:fldChar w:fldCharType="separate"/>
+            </w:r>
+            <w:r>
+              <w:rPr>
+                <w:noProof/>
+                <w:sz w:val="18"/>
+                <w:szCs w:val="18"/>
+              </w:rPr>
+              <w:t>«ServiceNote»</w:t>
+            </w:r>
+            <w:r>
+              <w:rPr>
+                <w:sz w:val="18"/>
+                <w:szCs w:val="18"/>
+              </w:rPr>
+              <w:fldChar w:fldCharType="end"/>
+            </w:r>
+          </w:p>
         </w:tc>
         <w:tc>
           <w:tcPr>
-            <w:tcW w:w="265" w:type="dxa"/>
-            <w:shd w:val="clear" w:color="auto" w:fill="4D677F"/>
+            <w:tcW w:w="260" w:type="dxa"/>
+            <w:shd w:val="clear" w:color="auto" w:fill="3E67B1"/>
           </w:tcPr>
           <w:p/>
         </w:tc>
@@ -771,16 +778,18 @@
       <w:tr>
         <w:tc>
           <w:tcPr>
-            <w:tcW w:w="9351" w:type="dxa"/>
-            <w:gridSpan w:val="4"/>
-            <w:shd w:val="clear" w:color="auto" w:fill="4D677F"/>
+            <w:tcW w:w="9360" w:type="dxa"/>
+            <w:gridSpan w:val="5"/>
+            <w:shd w:val="clear" w:color="auto" w:fill="3E67B1"/>
           </w:tcPr>
           <w:p/>
         </w:tc>
       </w:tr>
     </w:tbl>
-    <w:p/>
-    <w:p/>
+    <w:p>
+      <w:bookmarkStart w:id="0" w:name="_GoBack"/>
+      <w:bookmarkEnd w:id="0"/>
+    </w:p>
     <w:sectPr>
       <w:pgSz w:w="12240" w:h="15840"/>
       <w:pgMar w:top="1440" w:right="1440" w:bottom="1440" w:left="1440" w:header="720" w:footer="720" w:gutter="0"/>
@@ -1308,6 +1317,7 @@
     <w:lsdException w:name="HTML Sample" w:semiHidden="1" w:unhideWhenUsed="1"/>
     <w:lsdException w:name="HTML Typewriter" w:semiHidden="1" w:unhideWhenUsed="1"/>
     <w:lsdException w:name="HTML Variable" w:semiHidden="1" w:unhideWhenUsed="1"/>
+    <w:lsdException w:name="Normal Table" w:semiHidden="1" w:unhideWhenUsed="1"/>
     <w:lsdException w:name="annotation subject" w:semiHidden="1" w:unhideWhenUsed="1"/>
     <w:lsdException w:name="No List" w:semiHidden="1" w:unhideWhenUsed="1"/>
     <w:lsdException w:name="Outline List 1" w:semiHidden="1" w:unhideWhenUsed="1"/>
@@ -1354,8 +1364,10 @@
     <w:lsdException w:name="Table Subtle 2" w:semiHidden="1" w:unhideWhenUsed="1"/>
     <w:lsdException w:name="Table Web 1" w:semiHidden="1" w:unhideWhenUsed="1"/>
     <w:lsdException w:name="Table Web 2" w:semiHidden="1" w:unhideWhenUsed="1"/>
+    <w:lsdException w:name="Table Web 3" w:semiHidden="1" w:unhideWhenUsed="1"/>
     <w:lsdException w:name="Balloon Text" w:semiHidden="1" w:unhideWhenUsed="1"/>
     <w:lsdException w:name="Table Grid" w:uiPriority="39"/>
+    <w:lsdException w:name="Table Theme" w:semiHidden="1" w:unhideWhenUsed="1"/>
     <w:lsdException w:name="Placeholder Text" w:semiHidden="1"/>
     <w:lsdException w:name="No Spacing" w:uiPriority="1" w:qFormat="1"/>
     <w:lsdException w:name="Light Shading" w:uiPriority="60"/>
@@ -1579,7 +1591,7 @@
   <w:style w:type="paragraph" w:default="1" w:styleId="Normal">
     <w:name w:val="Normal"/>
     <w:qFormat/>
-    <w:rsid w:val="00760A7B"/>
+    <w:rsid w:val="00475E64"/>
   </w:style>
   <w:style w:type="character" w:default="1" w:styleId="DefaultParagraphFont">
     <w:name w:val="Default Paragraph Font"/>
@@ -1958,7 +1970,7 @@
 </file>
 
 <file path=customXml/itemProps1.xml><?xml version="1.0" encoding="utf-8"?>
-<ds:datastoreItem xmlns:ds="http://schemas.openxmlformats.org/officeDocument/2006/customXml" ds:itemID="{DE75C637-905B-402B-BB22-C33BDD34662D}">
+<ds:datastoreItem xmlns:ds="http://schemas.openxmlformats.org/officeDocument/2006/customXml" ds:itemID="{E2EC02A7-E4D4-491D-B6A5-AC7BF30AF989}">
   <ds:schemaRefs>
     <ds:schemaRef ds:uri="http://schemas.openxmlformats.org/officeDocument/2006/bibliography"/>
   </ds:schemaRefs>

</xml_diff>

<commit_message>
Checkpoint to troubleshoot the scope problem with submitAcceptUpgradeForm handler.
</commit_message>
<xml_diff>
--- a/CUWebinars.Web/App_Data/mergeTemplates/ConfirmationOfAccount.docx
+++ b/CUWebinars.Web/App_Data/mergeTemplates/ConfirmationOfAccount.docx
@@ -462,7 +462,15 @@
           <w:p/>
           <w:p>
             <w:r>
-              <w:t xml:space="preserve">You order </w:t>
+              <w:t>You</w:t>
+            </w:r>
+            <w:r>
+              <w:t>r</w:t>
+            </w:r>
+            <w:bookmarkStart w:id="0" w:name="_GoBack"/>
+            <w:bookmarkEnd w:id="0"/>
+            <w:r>
+              <w:t xml:space="preserve"> order </w:t>
             </w:r>
             <w:r>
               <w:t xml:space="preserve">for </w:t>
@@ -786,10 +794,7 @@
         </w:tc>
       </w:tr>
     </w:tbl>
-    <w:p>
-      <w:bookmarkStart w:id="0" w:name="_GoBack"/>
-      <w:bookmarkEnd w:id="0"/>
-    </w:p>
+    <w:p/>
     <w:sectPr>
       <w:pgSz w:w="12240" w:h="15840"/>
       <w:pgMar w:top="1440" w:right="1440" w:bottom="1440" w:left="1440" w:header="720" w:footer="720" w:gutter="0"/>
@@ -1970,7 +1975,7 @@
 </file>
 
 <file path=customXml/itemProps1.xml><?xml version="1.0" encoding="utf-8"?>
-<ds:datastoreItem xmlns:ds="http://schemas.openxmlformats.org/officeDocument/2006/customXml" ds:itemID="{E2EC02A7-E4D4-491D-B6A5-AC7BF30AF989}">
+<ds:datastoreItem xmlns:ds="http://schemas.openxmlformats.org/officeDocument/2006/customXml" ds:itemID="{574826DF-4805-4ABA-9B8C-CD02FCFB821E}">
   <ds:schemaRefs>
     <ds:schemaRef ds:uri="http://schemas.openxmlformats.org/officeDocument/2006/bibliography"/>
   </ds:schemaRefs>

</xml_diff>